<commit_message>
Deepen operator methods, source metrics, and scholarly verification
</commit_message>
<xml_diff>
--- a/output/manuscript/docx/rikishi.docx
+++ b/output/manuscript/docx/rikishi.docx
@@ -340,29 +340,163 @@
     </w:p>
     <w:p>
       <w:pPr>
+        <w:pStyle w:val="BodyText"/>
+      </w:pPr>
+      <w:r>
+        <w:rPr>
+          <w:lang w:val="en"/>
+        </w:rPr>
+        <w:t xml:space="preserve">SUMO’s original design addresses reusable upper-level categories and axioms</w:t>
+      </w:r>
+      <w:r>
+        <w:rPr>
+          <w:lang w:val="en"/>
+        </w:rPr>
+        <w:t xml:space="preserve"> </w:t>
+      </w:r>
+      <w:hyperlink r:id="rId12">
+        <w:r>
+          <w:rPr>
+            <w:rStyle w:val="Hyperlink"/>
+            <w:lang w:val="en"/>
+          </w:rPr>
+          <w:t xml:space="preserve">Niles and Pease, 2001</w:t>
+        </w:r>
+      </w:hyperlink>
+      <w:r>
+        <w:rPr>
+          <w:lang w:val="en"/>
+        </w:rPr>
+        <w:t xml:space="preserve">. Its current</w:t>
+      </w:r>
+      <w:r>
+        <w:rPr>
+          <w:lang w:val="en"/>
+        </w:rPr>
+        <w:t xml:space="preserve"> </w:t>
+      </w:r>
+      <w:hyperlink r:id="rId13">
+        <w:r>
+          <w:rPr>
+            <w:rStyle w:val="Hyperlink"/>
+            <w:lang w:val="en"/>
+          </w:rPr>
+          <w:t xml:space="preserve">SUO-KIF modeling guidance</w:t>
+        </w:r>
+      </w:hyperlink>
+      <w:r>
+        <w:rPr>
+          <w:lang w:val="en"/>
+        </w:rPr>
+        <w:t xml:space="preserve"> </w:t>
+      </w:r>
+      <w:r>
+        <w:rPr>
+          <w:lang w:val="en"/>
+        </w:rPr>
+        <w:t xml:space="preserve">connects natural-language definitions to formal statements. Rikishi therefore</w:t>
+      </w:r>
+      <w:r>
+        <w:rPr>
+          <w:lang w:val="en"/>
+        </w:rPr>
+        <w:t xml:space="preserve"> </w:t>
+      </w:r>
+      <w:r>
+        <w:rPr>
+          <w:lang w:val="en"/>
+        </w:rPr>
+        <w:t xml:space="preserve">retains complete source formulas and locations alongside a deliberately narrower</w:t>
+      </w:r>
+      <w:r>
+        <w:rPr>
+          <w:lang w:val="en"/>
+        </w:rPr>
+        <w:t xml:space="preserve"> </w:t>
+      </w:r>
+      <w:r>
+        <w:rPr>
+          <w:lang w:val="en"/>
+        </w:rPr>
+        <w:t xml:space="preserve">navigation graph. Translation is an additional scientific dependency:</w:t>
+      </w:r>
+      <w:r>
+        <w:rPr>
+          <w:lang w:val="en"/>
+        </w:rPr>
+        <w:t xml:space="preserve"> </w:t>
+      </w:r>
+      <w:hyperlink r:id="rId14">
+        <w:r>
+          <w:rPr>
+            <w:rStyle w:val="Hyperlink"/>
+            <w:lang w:val="en"/>
+          </w:rPr>
+          <w:t xml:space="preserve">Pease, 2023</w:t>
+        </w:r>
+      </w:hyperlink>
+      <w:r>
+        <w:rPr>
+          <w:lang w:val="en"/>
+        </w:rPr>
+        <w:t xml:space="preserve"> </w:t>
+      </w:r>
+      <w:r>
+        <w:rPr>
+          <w:lang w:val="en"/>
+        </w:rPr>
+        <w:t xml:space="preserve">describes conversion to typed</w:t>
+      </w:r>
+      <w:r>
+        <w:rPr>
+          <w:lang w:val="en"/>
+        </w:rPr>
+        <w:t xml:space="preserve"> </w:t>
+      </w:r>
+      <w:r>
+        <w:rPr>
+          <w:lang w:val="en"/>
+        </w:rPr>
+        <w:t xml:space="preserve">first-order form, illustrating why a source-language formula and a prover input</w:t>
+      </w:r>
+      <w:r>
+        <w:rPr>
+          <w:lang w:val="en"/>
+        </w:rPr>
+        <w:t xml:space="preserve"> </w:t>
+      </w:r>
+      <w:r>
+        <w:rPr>
+          <w:lang w:val="en"/>
+        </w:rPr>
+        <w:t xml:space="preserve">must have separately recorded identities.</w:t>
+      </w:r>
+    </w:p>
+    <w:p>
+      <w:pPr>
         <w:pStyle w:val="Heading1"/>
       </w:pPr>
-      <w:bookmarkStart w:id="12" w:name="_e098566c4548de53b78f9316dc15c84df210b58"/>
+      <w:bookmarkStart w:id="15" w:name="_e098566c4548de53b78f9316dc15c84df210b58"/>
       <w:r>
         <w:rPr>
           <w:lang w:val="en"/>
         </w:rPr>
         <w:t xml:space="preserve">System design</w:t>
       </w:r>
-      <w:bookmarkEnd w:id="12"/>
+      <w:bookmarkEnd w:id="15"/>
     </w:p>
     <w:p>
       <w:pPr>
         <w:pStyle w:val="Heading2"/>
       </w:pPr>
-      <w:bookmarkStart w:id="13" w:name="_ec942ad12c14c38a3378ac05fedf75b7878a53d"/>
+      <w:bookmarkStart w:id="16" w:name="_ec942ad12c14c38a3378ac05fedf75b7878a53d"/>
       <w:r>
         <w:rPr>
           <w:lang w:val="en"/>
         </w:rPr>
         <w:t xml:space="preserve">Source and runtime provenance</w:t>
       </w:r>
-      <w:bookmarkEnd w:id="13"/>
+      <w:bookmarkEnd w:id="16"/>
     </w:p>
     <w:p>
       <w:pPr>
@@ -486,14 +620,14 @@
       <w:pPr>
         <w:pStyle w:val="Heading2"/>
       </w:pPr>
-      <w:bookmarkStart w:id="14" w:name="_18d2ed2e5a44297d132d2f3158716619da4336a"/>
+      <w:bookmarkStart w:id="17" w:name="_18d2ed2e5a44297d132d2f3158716619da4336a"/>
       <w:r>
         <w:rPr>
           <w:lang w:val="en"/>
         </w:rPr>
         <w:t xml:space="preserve">Interfaces and quantification</w:t>
       </w:r>
-      <w:bookmarkEnd w:id="14"/>
+      <w:bookmarkEnd w:id="17"/>
     </w:p>
     <w:p>
       <w:pPr>
@@ -605,27 +739,27 @@
       <w:pPr>
         <w:pStyle w:val="Heading1"/>
       </w:pPr>
-      <w:bookmarkStart w:id="15" w:name="_81ea67958e0a761f4049a17463004df97fe6ec1"/>
+      <w:bookmarkStart w:id="18" w:name="_81ea67958e0a761f4049a17463004df97fe6ec1"/>
       <w:r>
         <w:rPr>
           <w:lang w:val="en"/>
         </w:rPr>
         <w:t xml:space="preserve">Corpus and reasoning observations</w:t>
       </w:r>
-      <w:bookmarkEnd w:id="15"/>
+      <w:bookmarkEnd w:id="18"/>
     </w:p>
     <w:p>
       <w:pPr>
         <w:pStyle w:val="Heading2"/>
       </w:pPr>
-      <w:bookmarkStart w:id="16" w:name="_f10863d01604bec5204919da87f16484a761e9a"/>
+      <w:bookmarkStart w:id="19" w:name="_f10863d01604bec5204919da87f16484a761e9a"/>
       <w:r>
         <w:rPr>
           <w:lang w:val="en"/>
         </w:rPr>
         <w:t xml:space="preserve">Corpus measurements</w:t>
       </w:r>
-      <w:bookmarkEnd w:id="16"/>
+      <w:bookmarkEnd w:id="19"/>
     </w:p>
     <w:p>
       <w:pPr>
@@ -861,18 +995,18 @@
           <wp:inline>
             <wp:extent cx="4800600" cy="2880360"/>
             <wp:effectExtent b="0" l="0" r="0" t="0"/>
-            <wp:docPr descr="Measured formula counts in the largest indexed SUMO source files. Counts describe source structure, not logical importance or proof coverage." title="" id="18" name="Picture"/>
+            <wp:docPr descr="Measured formula counts in the largest indexed SUMO source files. Counts describe source structure, not logical importance or proof coverage." title="" id="21" name="Picture"/>
             <a:graphic>
               <a:graphicData uri="http://schemas.openxmlformats.org/drawingml/2006/picture">
                 <pic:pic>
                   <pic:nvPicPr>
-                    <pic:cNvPr descr="figures/corpus-files.png" id="19" name="Picture"/>
+                    <pic:cNvPr descr="figures/corpus-files.png" id="22" name="Picture"/>
                     <pic:cNvPicPr>
                       <a:picLocks noChangeArrowheads="1" noChangeAspect="1"/>
                     </pic:cNvPicPr>
                   </pic:nvPicPr>
                   <pic:blipFill>
-                    <a:blip r:embed="rId17"/>
+                    <a:blip r:embed="rId20"/>
                     <a:stretch>
                       <a:fillRect/>
                     </a:stretch>
@@ -959,16 +1093,207 @@
     </w:p>
     <w:p>
       <w:pPr>
+        <w:pStyle w:val="CaptionedFigure"/>
+      </w:pPr>
+      <w:r>
+        <w:drawing>
+          <wp:inline>
+            <wp:extent cx="5067300" cy="2111375"/>
+            <wp:effectExtent b="0" l="0" r="0" t="0"/>
+            <wp:docPr descr="Source composition and direct graph coverage. Edge deduplication concerns identical predicate-subject-target triples; graph absence means absence from this restricted projection, not absence from SUMO semantics." title="" id="24" name="Picture"/>
+            <a:graphic>
+              <a:graphicData uri="http://schemas.openxmlformats.org/drawingml/2006/picture">
+                <pic:pic>
+                  <pic:nvPicPr>
+                    <pic:cNvPr descr="figures/corpus-composition.png" id="25" name="Picture"/>
+                    <pic:cNvPicPr>
+                      <a:picLocks noChangeArrowheads="1" noChangeAspect="1"/>
+                    </pic:cNvPicPr>
+                  </pic:nvPicPr>
+                  <pic:blipFill>
+                    <a:blip r:embed="rId23"/>
+                    <a:stretch>
+                      <a:fillRect/>
+                    </a:stretch>
+                  </pic:blipFill>
+                  <pic:spPr bwMode="auto">
+                    <a:xfrm>
+                      <a:off x="0" y="0"/>
+                      <a:ext cx="5067300" cy="2111375"/>
+                    </a:xfrm>
+                    <a:prstGeom prst="rect">
+                      <a:avLst/>
+                    </a:prstGeom>
+                    <a:noFill/>
+                    <a:ln w="9525">
+                      <a:noFill/>
+                      <a:headEnd/>
+                      <a:tailEnd/>
+                    </a:ln>
+                  </pic:spPr>
+                </pic:pic>
+              </a:graphicData>
+            </a:graphic>
+          </wp:inline>
+        </w:drawing>
+      </w:r>
+    </w:p>
+    <w:p>
+      <w:pPr>
+        <w:pStyle w:val="ImageCaption"/>
+      </w:pPr>
+      <w:r>
+        <w:rPr>
+          <w:lang w:val="en"/>
+        </w:rPr>
+        <w:t xml:space="preserve">Source composition and direct graph coverage. Edge deduplication concerns identical predicate-subject-target triples; graph absence means absence from this restricted projection, not absence from SUMO semantics.</w:t>
+      </w:r>
+    </w:p>
+    <w:p>
+      <w:pPr>
+        <w:pStyle w:val="FirstParagraph"/>
+      </w:pPr>
+      <w:r>
+        <w:rPr>
+          <w:lang w:val="en"/>
+        </w:rPr>
+        <w:t xml:space="preserve">File concentration is measured from each file’s share of parsed formulas.</w:t>
+      </w:r>
+      <w:r>
+        <w:rPr>
+          <w:lang w:val="en"/>
+        </w:rPr>
+        <w:t xml:space="preserve"> </w:t>
+      </w:r>
+      <w:r>
+        <w:rPr>
+          <w:lang w:val="en"/>
+        </w:rPr>
+        <w:t xml:space="preserve">The Herfindahl sum of squared shares summarizes this distribution; it is not an</w:t>
+      </w:r>
+      <w:r>
+        <w:rPr>
+          <w:lang w:val="en"/>
+        </w:rPr>
+        <w:t xml:space="preserve"> </w:t>
+      </w:r>
+      <w:r>
+        <w:rPr>
+          <w:lang w:val="en"/>
+        </w:rPr>
+        <w:t xml:space="preserve">ontology-quality score. The graph coverage denominator is all indexed symbols,</w:t>
+      </w:r>
+      <w:r>
+        <w:rPr>
+          <w:lang w:val="en"/>
+        </w:rPr>
+        <w:t xml:space="preserve"> </w:t>
+      </w:r>
+      <w:r>
+        <w:rPr>
+          <w:lang w:val="en"/>
+        </w:rPr>
+        <w:t xml:space="preserve">including symbols occurring only in formulas outside the asserted binary fragment.</w:t>
+      </w:r>
+      <w:r>
+        <w:rPr>
+          <w:lang w:val="en"/>
+        </w:rPr>
+        <w:t xml:space="preserve"> </w:t>
+      </w:r>
+      <w:r>
+        <w:rPr>
+          <w:lang w:val="en"/>
+        </w:rPr>
+        <w:t xml:space="preserve">The accompanying</w:t>
+      </w:r>
+      <w:r>
+        <w:rPr>
+          <w:lang w:val="en"/>
+        </w:rPr>
+        <w:t xml:space="preserve"> </w:t>
+      </w:r>
+      <w:r>
+        <w:rPr>
+          <w:rStyle w:val="VerbatimChar"/>
+          <w:lang w:val="en"/>
+        </w:rPr>
+        <w:t xml:space="preserve">output/analytics.json</w:t>
+      </w:r>
+      <w:r>
+        <w:rPr>
+          <w:lang w:val="en"/>
+        </w:rPr>
+        <w:t xml:space="preserve"> </w:t>
+      </w:r>
+      <w:r>
+        <w:rPr>
+          <w:lang w:val="en"/>
+        </w:rPr>
+        <w:t xml:space="preserve">and</w:t>
+      </w:r>
+      <w:r>
+        <w:rPr>
+          <w:lang w:val="en"/>
+        </w:rPr>
+        <w:t xml:space="preserve"> </w:t>
+      </w:r>
+      <w:r>
+        <w:rPr>
+          <w:rStyle w:val="VerbatimChar"/>
+          <w:lang w:val="en"/>
+        </w:rPr>
+        <w:t xml:space="preserve">output/measurements.md</w:t>
+      </w:r>
+      <w:r>
+        <w:rPr>
+          <w:lang w:val="en"/>
+        </w:rPr>
+        <w:t xml:space="preserve"> </w:t>
+      </w:r>
+      <w:r>
+        <w:rPr>
+          <w:lang w:val="en"/>
+        </w:rPr>
+        <w:t xml:space="preserve">define every</w:t>
+      </w:r>
+      <w:r>
+        <w:rPr>
+          <w:lang w:val="en"/>
+        </w:rPr>
+        <w:t xml:space="preserve"> </w:t>
+      </w:r>
+      <w:r>
+        <w:rPr>
+          <w:lang w:val="en"/>
+        </w:rPr>
+        <w:t xml:space="preserve">denominator, retain the source identity, and distinguish assertion multiplicity</w:t>
+      </w:r>
+      <w:r>
+        <w:rPr>
+          <w:lang w:val="en"/>
+        </w:rPr>
+        <w:t xml:space="preserve"> </w:t>
+      </w:r>
+      <w:r>
+        <w:rPr>
+          <w:lang w:val="en"/>
+        </w:rPr>
+        <w:t xml:space="preserve">from unique graph triples.</w:t>
+      </w:r>
+    </w:p>
+    <w:p>
+      <w:pPr>
         <w:pStyle w:val="Heading2"/>
       </w:pPr>
-      <w:bookmarkStart w:id="20" w:name="_daa383e624b945ada3467b364086927158866d6"/>
+      <w:bookmarkStart w:id="26" w:name="_daa383e624b945ada3467b364086927158866d6"/>
       <w:r>
         <w:rPr>
           <w:lang w:val="en"/>
         </w:rPr>
         <w:t xml:space="preserve">Source-bound taxonomic proof</w:t>
       </w:r>
-      <w:bookmarkEnd w:id="20"/>
+      <w:bookmarkEnd w:id="26"/>
     </w:p>
     <w:p>
       <w:pPr>
@@ -1271,6 +1596,116 @@
         <w:rPr>
           <w:lang w:val="en"/>
         </w:rPr>
+        <w:t xml:space="preserve">The</w:t>
+      </w:r>
+      <w:r>
+        <w:rPr>
+          <w:lang w:val="en"/>
+        </w:rPr>
+        <w:t xml:space="preserve"> </w:t>
+      </w:r>
+      <w:hyperlink r:id="rId27">
+        <w:r>
+          <w:rPr>
+            <w:rStyle w:val="Hyperlink"/>
+            <w:lang w:val="en"/>
+          </w:rPr>
+          <w:t xml:space="preserve">SZS ontology</w:t>
+        </w:r>
+      </w:hyperlink>
+      <w:r>
+        <w:rPr>
+          <w:lang w:val="en"/>
+        </w:rPr>
+        <w:t xml:space="preserve"> </w:t>
+      </w:r>
+      <w:r>
+        <w:rPr>
+          <w:lang w:val="en"/>
+        </w:rPr>
+        <w:t xml:space="preserve">distinguishes semantic outcomes from</w:t>
+      </w:r>
+      <w:r>
+        <w:rPr>
+          <w:lang w:val="en"/>
+        </w:rPr>
+        <w:t xml:space="preserve"> </w:t>
+      </w:r>
+      <w:r>
+        <w:rPr>
+          <w:lang w:val="en"/>
+        </w:rPr>
+        <w:t xml:space="preserve">failure to obtain an outcome. Rikishi retains prover status, process return code,</w:t>
+      </w:r>
+      <w:r>
+        <w:rPr>
+          <w:lang w:val="en"/>
+        </w:rPr>
+        <w:t xml:space="preserve"> </w:t>
+      </w:r>
+      <w:r>
+        <w:rPr>
+          <w:lang w:val="en"/>
+        </w:rPr>
+        <w:t xml:space="preserve">query, and input hash separately. A timeout is inconclusive; a contradictory</w:t>
+      </w:r>
+      <w:r>
+        <w:rPr>
+          <w:lang w:val="en"/>
+        </w:rPr>
+        <w:t xml:space="preserve"> </w:t>
+      </w:r>
+      <w:r>
+        <w:rPr>
+          <w:lang w:val="en"/>
+        </w:rPr>
+        <w:t xml:space="preserve">axiom set cannot validate the intended modeling interpretation. A theorem result</w:t>
+      </w:r>
+      <w:r>
+        <w:rPr>
+          <w:lang w:val="en"/>
+        </w:rPr>
+        <w:t xml:space="preserve"> </w:t>
+      </w:r>
+      <w:r>
+        <w:rPr>
+          <w:lang w:val="en"/>
+        </w:rPr>
+        <w:t xml:space="preserve">is conditional on the exact supplied axioms and the translation used to obtain</w:t>
+      </w:r>
+      <w:r>
+        <w:rPr>
+          <w:lang w:val="en"/>
+        </w:rPr>
+        <w:t xml:space="preserve"> </w:t>
+      </w:r>
+      <w:r>
+        <w:rPr>
+          <w:lang w:val="en"/>
+        </w:rPr>
+        <w:t xml:space="preserve">them. A satisfiable counterexample requires a model-finding result for that same</w:t>
+      </w:r>
+      <w:r>
+        <w:rPr>
+          <w:lang w:val="en"/>
+        </w:rPr>
+        <w:t xml:space="preserve"> </w:t>
+      </w:r>
+      <w:r>
+        <w:rPr>
+          <w:lang w:val="en"/>
+        </w:rPr>
+        <w:t xml:space="preserve">problem, rather than mere absence of a proof.</w:t>
+      </w:r>
+    </w:p>
+    <w:p>
+      <w:pPr>
+        <w:pStyle w:val="BodyText"/>
+      </w:pPr>
+      <w:r>
+        <w:rPr>
+          <w:lang w:val="en"/>
+        </w:rPr>
         <w:t xml:space="preserve">The native Sigma pipeline was also exercised with the four-constituent core</w:t>
       </w:r>
       <w:r>
@@ -1438,18 +1873,125 @@
       <w:pPr>
         <w:pStyle w:val="Heading1"/>
       </w:pPr>
-      <w:bookmarkStart w:id="21" w:name="_5e3495eed16034e1579a5c354594de4908913a6"/>
+      <w:bookmarkStart w:id="28" w:name="_5e3495eed16034e1579a5c354594de4908913a6"/>
       <w:r>
         <w:rPr>
           <w:lang w:val="en"/>
         </w:rPr>
         <w:t xml:space="preserve">A finite free-energy example</w:t>
       </w:r>
-      <w:bookmarkEnd w:id="21"/>
+      <w:bookmarkEnd w:id="28"/>
     </w:p>
     <w:p>
       <w:pPr>
         <w:pStyle w:val="FirstParagraph"/>
+      </w:pPr>
+      <w:r>
+        <w:rPr>
+          <w:lang w:val="en"/>
+        </w:rPr>
+        <w:t xml:space="preserve">The example implements the negative evidence lower bound (ELBO). The identity</w:t>
+      </w:r>
+      <w:r>
+        <w:rPr>
+          <w:lang w:val="en"/>
+        </w:rPr>
+        <w:t xml:space="preserve"> </w:t>
+      </w:r>
+      <w:r>
+        <w:rPr>
+          <w:lang w:val="en"/>
+        </w:rPr>
+        <w:t xml:space="preserve">relating ELBO, posterior KL divergence, and log evidence is presented in</w:t>
+      </w:r>
+      <w:r>
+        <w:rPr>
+          <w:lang w:val="en"/>
+        </w:rPr>
+        <w:t xml:space="preserve"> </w:t>
+      </w:r>
+      <w:hyperlink r:id="rId29">
+        <w:r>
+          <w:rPr>
+            <w:rStyle w:val="Hyperlink"/>
+            <w:lang w:val="en"/>
+          </w:rPr>
+          <w:t xml:space="preserve">Blei, Kucukelbir, and McAuliffe, 2017, Section 2.2</w:t>
+        </w:r>
+      </w:hyperlink>
+      <w:r>
+        <w:rPr>
+          <w:lang w:val="en"/>
+        </w:rPr>
+        <w:t xml:space="preserve">.</w:t>
+      </w:r>
+      <w:r>
+        <w:rPr>
+          <w:lang w:val="en"/>
+        </w:rPr>
+        <w:t xml:space="preserve"> </w:t>
+      </w:r>
+      <w:hyperlink r:id="rId30">
+        <w:r>
+          <w:rPr>
+            <w:rStyle w:val="Hyperlink"/>
+            <w:lang w:val="en"/>
+          </w:rPr>
+          <w:t xml:space="preserve">Friston, 2010, Box 1</w:t>
+        </w:r>
+      </w:hyperlink>
+      <w:r>
+        <w:rPr>
+          <w:lang w:val="en"/>
+        </w:rPr>
+        <w:t xml:space="preserve"> </w:t>
+      </w:r>
+      <w:r>
+        <w:rPr>
+          <w:lang w:val="en"/>
+        </w:rPr>
+        <w:t xml:space="preserve">places a corresponding</w:t>
+      </w:r>
+      <w:r>
+        <w:rPr>
+          <w:lang w:val="en"/>
+        </w:rPr>
+        <w:t xml:space="preserve"> </w:t>
+      </w:r>
+      <w:r>
+        <w:rPr>
+          <w:lang w:val="en"/>
+        </w:rPr>
+        <w:t xml:space="preserve">variational objective in a broader account of perception and action. Here only</w:t>
+      </w:r>
+      <w:r>
+        <w:rPr>
+          <w:lang w:val="en"/>
+        </w:rPr>
+        <w:t xml:space="preserve"> </w:t>
+      </w:r>
+      <w:r>
+        <w:rPr>
+          <w:lang w:val="en"/>
+        </w:rPr>
+        <w:t xml:space="preserve">the finite probabilistic identity is implemented. No dynamics, policy selection,</w:t>
+      </w:r>
+      <w:r>
+        <w:rPr>
+          <w:lang w:val="en"/>
+        </w:rPr>
+        <w:t xml:space="preserve"> </w:t>
+      </w:r>
+      <w:r>
+        <w:rPr>
+          <w:lang w:val="en"/>
+        </w:rPr>
+        <w:t xml:space="preserve">neural implementation, or empirical test of that broader account is supplied.</w:t>
+      </w:r>
+    </w:p>
+    <w:p>
+      <w:pPr>
+        <w:pStyle w:val="BodyText"/>
       </w:pPr>
       <w:r>
         <w:rPr>
@@ -2031,18 +2573,18 @@
           <wp:inline>
             <wp:extent cx="4800600" cy="2800350"/>
             <wp:effectExtent b="0" l="0" r="0" t="0"/>
-            <wp:docPr descr="Finite variational free energy over the binary candidate probability. The dashed line is surprise; the marked minimum occurs at the exact posterior probability 0.8." title="" id="23" name="Picture"/>
+            <wp:docPr descr="Finite variational free energy over the binary candidate probability. The dashed line is surprise; the marked minimum occurs at the exact posterior probability 0.8." title="" id="32" name="Picture"/>
             <a:graphic>
               <a:graphicData uri="http://schemas.openxmlformats.org/drawingml/2006/picture">
                 <pic:pic>
                   <pic:nvPicPr>
-                    <pic:cNvPr descr="figures/fep-free-energy.png" id="24" name="Picture"/>
+                    <pic:cNvPr descr="figures/fep-free-energy.png" id="33" name="Picture"/>
                     <pic:cNvPicPr>
                       <a:picLocks noChangeArrowheads="1" noChangeAspect="1"/>
                     </pic:cNvPicPr>
                   </pic:nvPicPr>
                   <pic:blipFill>
-                    <a:blip r:embed="rId22"/>
+                    <a:blip r:embed="rId31"/>
                     <a:stretch>
                       <a:fillRect/>
                     </a:stretch>
@@ -2202,14 +2744,14 @@
       <w:pPr>
         <w:pStyle w:val="Heading1"/>
       </w:pPr>
-      <w:bookmarkStart w:id="25" w:name="_634b25a5d4a85bf6849791b8b38956e8470f57d"/>
+      <w:bookmarkStart w:id="34" w:name="_634b25a5d4a85bf6849791b8b38956e8470f57d"/>
       <w:r>
         <w:rPr>
           <w:lang w:val="en"/>
         </w:rPr>
         <w:t xml:space="preserve">Connections to formalization</w:t>
       </w:r>
-      <w:bookmarkEnd w:id="25"/>
+      <w:bookmarkEnd w:id="34"/>
     </w:p>
     <w:p>
       <w:pPr>
@@ -2322,428 +2864,8 @@
         <w:rPr>
           <w:lang w:val="en"/>
         </w:rPr>
-        <w:t xml:space="preserve">An important semantic boundary occurs at zero reference mass. The inspected Lean</w:t>
-      </w:r>
-      <w:r>
-        <w:rPr>
-          <w:lang w:val="en"/>
-        </w:rPr>
-        <w:t xml:space="preserve"> </w:t>
-      </w:r>
-      <w:r>
-        <w:rPr>
-          <w:lang w:val="en"/>
-        </w:rPr>
-        <w:t xml:space="preserve">definition uses totalized real division and a</w:t>
-      </w:r>
-      <w:r>
-        <w:rPr>
-          <w:lang w:val="en"/>
-        </w:rPr>
-        <w:t xml:space="preserve"> </w:t>
-      </w:r>
-      <w:r>
-        <w:rPr>
-          <w:rStyle w:val="VerbatimChar"/>
-          <w:lang w:val="en"/>
-        </w:rPr>
-        <w:t xml:space="preserve">klFun</w:t>
-      </w:r>
-      <w:r>
-        <w:rPr>
-          <w:lang w:val="en"/>
-        </w:rPr>
-        <w:t xml:space="preserve"> </w:t>
-      </w:r>
-      <w:r>
-        <w:rPr>
-          <w:lang w:val="en"/>
-        </w:rPr>
-        <w:t xml:space="preserve">integrand. Its logarithmic</w:t>
-      </w:r>
-      <w:r>
-        <w:rPr>
-          <w:lang w:val="en"/>
-        </w:rPr>
-        <w:t xml:space="preserve"> </w:t>
-      </w:r>
-      <w:r>
-        <w:rPr>
-          <w:lang w:val="en"/>
-        </w:rPr>
-        <w:t xml:space="preserve">identity requires strict support assumptions. The numerical operator’s rejection</w:t>
-      </w:r>
-      <w:r>
-        <w:rPr>
-          <w:lang w:val="en"/>
-        </w:rPr>
-        <w:t xml:space="preserve"> </w:t>
-      </w:r>
-      <w:r>
-        <w:rPr>
-          <w:lang w:val="en"/>
-        </w:rPr>
-        <w:t xml:space="preserve">of unsupported positive mass therefore cannot be identified with the Lean definition</w:t>
-      </w:r>
-      <w:r>
-        <w:rPr>
-          <w:lang w:val="en"/>
-        </w:rPr>
-        <w:t xml:space="preserve"> </w:t>
-      </w:r>
-      <w:r>
-        <w:rPr>
-          <w:lang w:val="en"/>
-        </w:rPr>
-        <w:t xml:space="preserve">over every input. A formal bridge must state its restricted domain and prove the</w:t>
-      </w:r>
-      <w:r>
-        <w:rPr>
-          <w:lang w:val="en"/>
-        </w:rPr>
-        <w:t xml:space="preserve"> </w:t>
-      </w:r>
-      <w:r>
-        <w:rPr>
-          <w:lang w:val="en"/>
-        </w:rPr>
-        <w:t xml:space="preserve">relationship rather than infer it from the shared name</w:t>
-      </w:r>
-      <w:r>
-        <w:rPr>
-          <w:lang w:val="en"/>
-        </w:rPr>
-        <w:t xml:space="preserve"> </w:t>
-      </w:r>
-      <w:r>
-        <w:rPr>
-          <w:lang w:val="en"/>
-        </w:rPr>
-        <w:t xml:space="preserve">“KL”</w:t>
-      </w:r>
-      <w:r>
-        <w:rPr>
-          <w:lang w:val="en"/>
-        </w:rPr>
-        <w:t xml:space="preserve">.</w:t>
-      </w:r>
-    </w:p>
-    <w:p>
-      <w:pPr>
-        <w:pStyle w:val="BodyText"/>
-      </w:pPr>
-      <w:r>
-        <w:rPr>
-          <w:lang w:val="en"/>
-        </w:rPr>
-        <w:t xml:space="preserve">The candidate vocabulary mappings in</w:t>
-      </w:r>
-      <w:r>
-        <w:rPr>
-          <w:lang w:val="en"/>
-        </w:rPr>
-        <w:t xml:space="preserve"> </w:t>
-      </w:r>
-      <w:r>
-        <w:rPr>
-          <w:rStyle w:val="VerbatimChar"/>
-          <w:lang w:val="en"/>
-        </w:rPr>
-        <w:t xml:space="preserve">config/fep_mappings.json</w:t>
-      </w:r>
-      <w:r>
-        <w:rPr>
-          <w:lang w:val="en"/>
-        </w:rPr>
-        <w:t xml:space="preserve"> </w:t>
-      </w:r>
-      <w:r>
-        <w:rPr>
-          <w:lang w:val="en"/>
-        </w:rPr>
-        <w:t xml:space="preserve">identify</w:t>
-      </w:r>
-      <w:r>
-        <w:rPr>
-          <w:lang w:val="en"/>
-        </w:rPr>
-        <w:t xml:space="preserve"> </w:t>
-      </w:r>
-      <w:r>
-        <w:rPr>
-          <w:lang w:val="en"/>
-        </w:rPr>
-        <w:t xml:space="preserve">probability, functions, real-valued quantities, reasoning, processes, and agents as</w:t>
-      </w:r>
-      <w:r>
-        <w:rPr>
-          <w:lang w:val="en"/>
-        </w:rPr>
-        <w:t xml:space="preserve"> </w:t>
-      </w:r>
-      <w:r>
-        <w:rPr>
-          <w:lang w:val="en"/>
-        </w:rPr>
-        <w:t xml:space="preserve">areas to investigate in SUMO. Each mapping is explicitly proposed and carries an</w:t>
-      </w:r>
-      <w:r>
-        <w:rPr>
-          <w:lang w:val="en"/>
-        </w:rPr>
-        <w:t xml:space="preserve"> </w:t>
-      </w:r>
-      <w:r>
-        <w:rPr>
-          <w:lang w:val="en"/>
-        </w:rPr>
-        <w:t xml:space="preserve">outstanding obligation. Shared vocabulary alone does not establish mathematical</w:t>
-      </w:r>
-      <w:r>
-        <w:rPr>
-          <w:lang w:val="en"/>
-        </w:rPr>
-        <w:t xml:space="preserve"> </w:t>
-      </w:r>
-      <w:r>
-        <w:rPr>
-          <w:lang w:val="en"/>
-        </w:rPr>
-        <w:t xml:space="preserve">equivalence. A future bridge must supply a carrier interpretation, type and argument</w:t>
-      </w:r>
-      <w:r>
-        <w:rPr>
-          <w:lang w:val="en"/>
-        </w:rPr>
-        <w:t xml:space="preserve"> </w:t>
-      </w:r>
-      <w:r>
-        <w:rPr>
-          <w:lang w:val="en"/>
-        </w:rPr>
-        <w:t xml:space="preserve">translation, normalization and support conditions, and a soundness argument for</w:t>
-      </w:r>
-      <w:r>
-        <w:rPr>
-          <w:lang w:val="en"/>
-        </w:rPr>
-        <w:t xml:space="preserve"> </w:t>
-      </w:r>
-      <w:r>
-        <w:rPr>
-          <w:lang w:val="en"/>
-        </w:rPr>
-        <w:t xml:space="preserve">the exact target fragment.</w:t>
-      </w:r>
-    </w:p>
-    <w:p>
-      <w:pPr>
-        <w:pStyle w:val="BodyText"/>
-      </w:pPr>
-      <w:r>
-        <w:rPr>
-          <w:lang w:val="en"/>
-        </w:rPr>
-        <w:t xml:space="preserve">The separate</w:t>
-      </w:r>
-      <w:r>
-        <w:rPr>
-          <w:lang w:val="en"/>
-        </w:rPr>
-        <w:t xml:space="preserve"> </w:t>
-      </w:r>
-      <w:r>
-        <w:rPr>
-          <w:rStyle w:val="VerbatimChar"/>
-          <w:lang w:val="en"/>
-        </w:rPr>
-        <w:t xml:space="preserve">examples/fep-ontology.kif</w:t>
-      </w:r>
-      <w:r>
-        <w:rPr>
-          <w:lang w:val="en"/>
-        </w:rPr>
-        <w:t xml:space="preserve"> </w:t>
-      </w:r>
-      <w:r>
-        <w:rPr>
-          <w:lang w:val="en"/>
-        </w:rPr>
-        <w:t xml:space="preserve">extension gives an inspectable vocabulary</w:t>
-      </w:r>
-      <w:r>
-        <w:rPr>
-          <w:lang w:val="en"/>
-        </w:rPr>
-        <w:t xml:space="preserve"> </w:t>
-      </w:r>
-      <w:r>
-        <w:rPr>
-          <w:lang w:val="en"/>
-        </w:rPr>
-        <w:t xml:space="preserve">experiment:</w:t>
-      </w:r>
-      <w:r>
-        <w:rPr>
-          <w:lang w:val="en"/>
-        </w:rPr>
-        <w:t xml:space="preserve"> </w:t>
-      </w:r>
-      <w:r>
-        <w:rPr>
-          <w:rStyle w:val="VerbatimChar"/>
-          <w:lang w:val="en"/>
-        </w:rPr>
-        <w:t xml:space="preserve">RikishiVariationalInference</w:t>
-      </w:r>
-      <w:r>
-        <w:rPr>
-          <w:lang w:val="en"/>
-        </w:rPr>
-        <w:t xml:space="preserve"> </w:t>
-      </w:r>
-      <w:r>
-        <w:rPr>
-          <w:lang w:val="en"/>
-        </w:rPr>
-        <w:t xml:space="preserve">is proposed as a subclass of</w:t>
-      </w:r>
-      <w:r>
-        <w:rPr>
-          <w:lang w:val="en"/>
-        </w:rPr>
-        <w:t xml:space="preserve"> </w:t>
-      </w:r>
-      <w:r>
-        <w:rPr>
-          <w:rStyle w:val="VerbatimChar"/>
-          <w:lang w:val="en"/>
-        </w:rPr>
-        <w:t xml:space="preserve">Reasoning</w:t>
-      </w:r>
-      <w:r>
-        <w:rPr>
-          <w:lang w:val="en"/>
-        </w:rPr>
-        <w:t xml:space="preserve">,</w:t>
-      </w:r>
-      <w:r>
-        <w:rPr>
-          <w:lang w:val="en"/>
-        </w:rPr>
-        <w:t xml:space="preserve"> </w:t>
-      </w:r>
-      <w:r>
-        <w:rPr>
-          <w:rStyle w:val="VerbatimChar"/>
-          <w:lang w:val="en"/>
-        </w:rPr>
-        <w:t xml:space="preserve">RikishiFiniteGenerativeModel</w:t>
-      </w:r>
-      <w:r>
-        <w:rPr>
-          <w:lang w:val="en"/>
-        </w:rPr>
-        <w:t xml:space="preserve"> </w:t>
-      </w:r>
-      <w:r>
-        <w:rPr>
-          <w:lang w:val="en"/>
-        </w:rPr>
-        <w:t xml:space="preserve">as a subclass of</w:t>
-      </w:r>
-      <w:r>
-        <w:rPr>
-          <w:lang w:val="en"/>
-        </w:rPr>
-        <w:t xml:space="preserve"> </w:t>
-      </w:r>
-      <w:r>
-        <w:rPr>
-          <w:rStyle w:val="VerbatimChar"/>
-          <w:lang w:val="en"/>
-        </w:rPr>
-        <w:t xml:space="preserve">Proposition</w:t>
-      </w:r>
-      <w:r>
-        <w:rPr>
-          <w:lang w:val="en"/>
-        </w:rPr>
-        <w:t xml:space="preserve">, and the binary example</w:t>
-      </w:r>
-      <w:r>
-        <w:rPr>
-          <w:lang w:val="en"/>
-        </w:rPr>
-        <w:t xml:space="preserve"> </w:t>
-      </w:r>
-      <w:r>
-        <w:rPr>
-          <w:lang w:val="en"/>
-        </w:rPr>
-        <w:t xml:space="preserve">as an instance of the inference class. The six formulas include documentation of</w:t>
-      </w:r>
-      <w:r>
-        <w:rPr>
-          <w:lang w:val="en"/>
-        </w:rPr>
-        <w:t xml:space="preserve"> </w:t>
-      </w:r>
-      <w:r>
-        <w:rPr>
-          <w:lang w:val="en"/>
-        </w:rPr>
-        <w:t xml:space="preserve">their intended use and limitations. These author-created assertions are kept</w:t>
-      </w:r>
-      <w:r>
-        <w:rPr>
-          <w:lang w:val="en"/>
-        </w:rPr>
-        <w:t xml:space="preserve"> </w:t>
-      </w:r>
-      <w:r>
-        <w:rPr>
-          <w:lang w:val="en"/>
-        </w:rPr>
-        <w:t xml:space="preserve">outside the upstream checkout. They neither enforce numerical normalization nor</w:t>
-      </w:r>
-      <w:r>
-        <w:rPr>
-          <w:lang w:val="en"/>
-        </w:rPr>
-        <w:t xml:space="preserve"> </w:t>
-      </w:r>
-      <w:r>
-        <w:rPr>
-          <w:lang w:val="en"/>
-        </w:rPr>
-        <w:t xml:space="preserve">transport a Lean proof; their adequacy as an ontology model remains a research</w:t>
-      </w:r>
-      <w:r>
-        <w:rPr>
-          <w:lang w:val="en"/>
-        </w:rPr>
-        <w:t xml:space="preserve"> </w:t>
-      </w:r>
-      <w:r>
-        <w:rPr>
-          <w:lang w:val="en"/>
-        </w:rPr>
-        <w:t xml:space="preserve">question requiring explicit interpretation and review.</w:t>
-      </w:r>
-    </w:p>
-    <w:p>
-      <w:pPr>
-        <w:pStyle w:val="Heading1"/>
-      </w:pPr>
-      <w:bookmarkStart w:id="26" w:name="_79901e7c21d0568c315d1f541fad2179ae2a52b"/>
-      <w:r>
-        <w:rPr>
-          <w:lang w:val="en"/>
-        </w:rPr>
-        <w:t xml:space="preserve">Reproducible workflow</w:t>
-      </w:r>
-      <w:bookmarkEnd w:id="26"/>
+        <w:t xml:space="preserve">The pinned source also contains explicit disjoint-point-mass witnesses:</w:t>
+      </w:r>
     </w:p>
     <w:p>
       <w:pPr>
@@ -2755,9 +2877,16 @@
       </w:pPr>
       <w:r>
         <w:rPr>
-          <w:lang w:val="en"/>
-        </w:rPr>
-        <w:t xml:space="preserve">Prepare the declared Python environment and external storage paths.</w:t>
+          <w:rStyle w:val="VerbatimChar"/>
+          <w:lang w:val="en"/>
+        </w:rPr>
+        <w:t xml:space="preserve">crossEntropy_disjoint_pointMass_totalized</w:t>
+      </w:r>
+      <w:r>
+        <w:rPr>
+          <w:lang w:val="en"/>
+        </w:rPr>
+        <w:t xml:space="preserve">;</w:t>
       </w:r>
     </w:p>
     <w:p>
@@ -2770,81 +2899,16 @@
       </w:pPr>
       <w:r>
         <w:rPr>
-          <w:lang w:val="en"/>
-        </w:rPr>
-        <w:t xml:space="preserve">Install the pinned SUMO sources and runtime using the package’s operator commands.</w:t>
-      </w:r>
-    </w:p>
-    <w:p>
-      <w:pPr>
-        <w:pStyle w:val="Compact"/>
-        <w:numPr>
-          <w:ilvl w:val="0"/>
-          <w:numId w:val="1001"/>
-        </w:numPr>
-      </w:pPr>
-      <w:r>
-        <w:rPr>
-          <w:lang w:val="en"/>
-        </w:rPr>
-        <w:t xml:space="preserve">Record source and tool identities before indexing or reasoning.</w:t>
-      </w:r>
-    </w:p>
-    <w:p>
-      <w:pPr>
-        <w:pStyle w:val="Compact"/>
-        <w:numPr>
-          <w:ilvl w:val="0"/>
-          <w:numId w:val="1001"/>
-        </w:numPr>
-      </w:pPr>
-      <w:r>
-        <w:rPr>
-          <w:lang w:val="en"/>
-        </w:rPr>
-        <w:t xml:space="preserve">Retain query, source context, diagnostics, and proof-search output together.</w:t>
-      </w:r>
-    </w:p>
-    <w:p>
-      <w:pPr>
-        <w:pStyle w:val="Compact"/>
-        <w:numPr>
-          <w:ilvl w:val="0"/>
-          <w:numId w:val="1001"/>
-        </w:numPr>
-      </w:pPr>
-      <w:r>
-        <w:rPr>
-          <w:lang w:val="en"/>
-        </w:rPr>
-        <w:t xml:space="preserve">Execute the finite example and inspect its residual and negative controls.</w:t>
-      </w:r>
-    </w:p>
-    <w:p>
-      <w:pPr>
-        <w:pStyle w:val="Compact"/>
-        <w:numPr>
-          <w:ilvl w:val="0"/>
-          <w:numId w:val="1001"/>
-        </w:numPr>
-      </w:pPr>
-      <w:r>
-        <w:rPr>
-          <w:lang w:val="en"/>
-        </w:rPr>
-        <w:t xml:space="preserve">Render this manuscript through the docxology/template adapters and inspect the</w:t>
-      </w:r>
-      <w:r>
-        <w:rPr>
-          <w:lang w:val="en"/>
-        </w:rPr>
-        <w:t xml:space="preserve"> </w:t>
-      </w:r>
-      <w:r>
-        <w:rPr>
-          <w:lang w:val="en"/>
-        </w:rPr>
-        <w:t xml:space="preserve">resulting PDF, DOCX, and HTML.</w:t>
+          <w:rStyle w:val="VerbatimChar"/>
+          <w:lang w:val="en"/>
+        </w:rPr>
+        <w:t xml:space="preserve">finiteKL_disjoint_pointMass_totalized</w:t>
+      </w:r>
+      <w:r>
+        <w:rPr>
+          <w:lang w:val="en"/>
+        </w:rPr>
+        <w:t xml:space="preserve">.</w:t>
       </w:r>
     </w:p>
     <w:p>
@@ -2855,212 +2919,475 @@
         <w:rPr>
           <w:lang w:val="en"/>
         </w:rPr>
-        <w:t xml:space="preserve">The renderer writes numerical JSON and a figure before publication. It records</w:t>
-      </w:r>
-      <w:r>
-        <w:rPr>
-          <w:lang w:val="en"/>
-        </w:rPr>
-        <w:t xml:space="preserve"> </w:t>
-      </w:r>
-      <w:r>
-        <w:rPr>
-          <w:lang w:val="en"/>
-        </w:rPr>
-        <w:t xml:space="preserve">source and output hashes, artifact sizes, and the template revision in a receipt.</w:t>
-      </w:r>
-      <w:r>
-        <w:rPr>
-          <w:lang w:val="en"/>
-        </w:rPr>
-        <w:t xml:space="preserve"> </w:t>
-      </w:r>
-      <w:r>
-        <w:rPr>
-          <w:lang w:val="en"/>
-        </w:rPr>
-        <w:t xml:space="preserve">Those records support byte-level reproducibility and identify dependencies; they</w:t>
-      </w:r>
-      <w:r>
-        <w:rPr>
-          <w:lang w:val="en"/>
-        </w:rPr>
-        <w:t xml:space="preserve"> </w:t>
-      </w:r>
-      <w:r>
-        <w:rPr>
-          <w:lang w:val="en"/>
-        </w:rPr>
-        <w:t xml:space="preserve">do not replace scientific review. A changed upstream revision, local configuration,</w:t>
-      </w:r>
-      <w:r>
-        <w:rPr>
-          <w:lang w:val="en"/>
-        </w:rPr>
-        <w:t xml:space="preserve"> </w:t>
-      </w:r>
-      <w:r>
-        <w:rPr>
-          <w:lang w:val="en"/>
-        </w:rPr>
-        <w:t xml:space="preserve">or rendering dependency requires a fresh receipt.</w:t>
+        <w:t xml:space="preserve">Their stated values are respectively zero</w:t>
+      </w:r>
+      <w:r>
+        <w:rPr>
+          <w:lang w:val="en"/>
+        </w:rPr>
+        <w:t xml:space="preserve"> </w:t>
+      </w:r>
+      <w:r>
+        <w:rPr>
+          <w:lang w:val="en"/>
+        </w:rPr>
+        <w:t xml:space="preserve">and one under the source’s totalized real operations. These are source-level</w:t>
+      </w:r>
+      <w:r>
+        <w:rPr>
+          <w:lang w:val="en"/>
+        </w:rPr>
+        <w:t xml:space="preserve"> </w:t>
+      </w:r>
+      <w:r>
+        <w:rPr>
+          <w:lang w:val="en"/>
+        </w:rPr>
+        <w:t xml:space="preserve">counterexamples to treating every named KL quantity as the extended-real</w:t>
+      </w:r>
+      <w:r>
+        <w:rPr>
+          <w:lang w:val="en"/>
+        </w:rPr>
+        <w:t xml:space="preserve"> </w:t>
+      </w:r>
+      <w:r>
+        <w:rPr>
+          <w:lang w:val="en"/>
+        </w:rPr>
+        <w:t xml:space="preserve">divergence, not numerical results computed by Rikishi.</w:t>
+      </w:r>
+    </w:p>
+    <w:p>
+      <w:pPr>
+        <w:pStyle w:val="BodyText"/>
+      </w:pPr>
+      <w:r>
+        <w:rPr>
+          <w:lang w:val="en"/>
+        </w:rPr>
+        <w:t xml:space="preserve">An important semantic boundary occurs at zero reference mass. The inspected Lean</w:t>
+      </w:r>
+      <w:r>
+        <w:rPr>
+          <w:lang w:val="en"/>
+        </w:rPr>
+        <w:t xml:space="preserve"> </w:t>
+      </w:r>
+      <w:r>
+        <w:rPr>
+          <w:lang w:val="en"/>
+        </w:rPr>
+        <w:t xml:space="preserve">definition uses totalized real division and a</w:t>
+      </w:r>
+      <w:r>
+        <w:rPr>
+          <w:lang w:val="en"/>
+        </w:rPr>
+        <w:t xml:space="preserve"> </w:t>
+      </w:r>
+      <w:r>
+        <w:rPr>
+          <w:rStyle w:val="VerbatimChar"/>
+          <w:lang w:val="en"/>
+        </w:rPr>
+        <w:t xml:space="preserve">klFun</w:t>
+      </w:r>
+      <w:r>
+        <w:rPr>
+          <w:lang w:val="en"/>
+        </w:rPr>
+        <w:t xml:space="preserve"> </w:t>
+      </w:r>
+      <w:r>
+        <w:rPr>
+          <w:lang w:val="en"/>
+        </w:rPr>
+        <w:t xml:space="preserve">integrand. Its logarithmic</w:t>
+      </w:r>
+      <w:r>
+        <w:rPr>
+          <w:lang w:val="en"/>
+        </w:rPr>
+        <w:t xml:space="preserve"> </w:t>
+      </w:r>
+      <w:r>
+        <w:rPr>
+          <w:lang w:val="en"/>
+        </w:rPr>
+        <w:t xml:space="preserve">identity requires strict support assumptions. The numerical operator’s rejection</w:t>
+      </w:r>
+      <w:r>
+        <w:rPr>
+          <w:lang w:val="en"/>
+        </w:rPr>
+        <w:t xml:space="preserve"> </w:t>
+      </w:r>
+      <w:r>
+        <w:rPr>
+          <w:lang w:val="en"/>
+        </w:rPr>
+        <w:t xml:space="preserve">of unsupported positive mass therefore cannot be identified with the Lean definition</w:t>
+      </w:r>
+      <w:r>
+        <w:rPr>
+          <w:lang w:val="en"/>
+        </w:rPr>
+        <w:t xml:space="preserve"> </w:t>
+      </w:r>
+      <w:r>
+        <w:rPr>
+          <w:lang w:val="en"/>
+        </w:rPr>
+        <w:t xml:space="preserve">over every input. A formal bridge must state its restricted domain and prove the</w:t>
+      </w:r>
+      <w:r>
+        <w:rPr>
+          <w:lang w:val="en"/>
+        </w:rPr>
+        <w:t xml:space="preserve"> </w:t>
+      </w:r>
+      <w:r>
+        <w:rPr>
+          <w:lang w:val="en"/>
+        </w:rPr>
+        <w:t xml:space="preserve">relationship rather than infer it from the shared name</w:t>
+      </w:r>
+      <w:r>
+        <w:rPr>
+          <w:lang w:val="en"/>
+        </w:rPr>
+        <w:t xml:space="preserve"> </w:t>
+      </w:r>
+      <w:r>
+        <w:rPr>
+          <w:lang w:val="en"/>
+        </w:rPr>
+        <w:t xml:space="preserve">“KL”</w:t>
+      </w:r>
+      <w:r>
+        <w:rPr>
+          <w:lang w:val="en"/>
+        </w:rPr>
+        <w:t xml:space="preserve">.</w:t>
+      </w:r>
+    </w:p>
+    <w:p>
+      <w:pPr>
+        <w:pStyle w:val="BodyText"/>
+      </w:pPr>
+      <w:r>
+        <w:rPr>
+          <w:lang w:val="en"/>
+        </w:rPr>
+        <w:t xml:space="preserve">The candidate vocabulary mappings in</w:t>
+      </w:r>
+      <w:r>
+        <w:rPr>
+          <w:lang w:val="en"/>
+        </w:rPr>
+        <w:t xml:space="preserve"> </w:t>
+      </w:r>
+      <w:r>
+        <w:rPr>
+          <w:rStyle w:val="VerbatimChar"/>
+          <w:lang w:val="en"/>
+        </w:rPr>
+        <w:t xml:space="preserve">config/fep_mappings.json</w:t>
+      </w:r>
+      <w:r>
+        <w:rPr>
+          <w:lang w:val="en"/>
+        </w:rPr>
+        <w:t xml:space="preserve"> </w:t>
+      </w:r>
+      <w:r>
+        <w:rPr>
+          <w:lang w:val="en"/>
+        </w:rPr>
+        <w:t xml:space="preserve">identify</w:t>
+      </w:r>
+      <w:r>
+        <w:rPr>
+          <w:lang w:val="en"/>
+        </w:rPr>
+        <w:t xml:space="preserve"> </w:t>
+      </w:r>
+      <w:r>
+        <w:rPr>
+          <w:lang w:val="en"/>
+        </w:rPr>
+        <w:t xml:space="preserve">probability, functions, real-valued quantities, reasoning, processes, and agents as</w:t>
+      </w:r>
+      <w:r>
+        <w:rPr>
+          <w:lang w:val="en"/>
+        </w:rPr>
+        <w:t xml:space="preserve"> </w:t>
+      </w:r>
+      <w:r>
+        <w:rPr>
+          <w:lang w:val="en"/>
+        </w:rPr>
+        <w:t xml:space="preserve">areas to investigate in SUMO. Each mapping is explicitly proposed and carries an</w:t>
+      </w:r>
+      <w:r>
+        <w:rPr>
+          <w:lang w:val="en"/>
+        </w:rPr>
+        <w:t xml:space="preserve"> </w:t>
+      </w:r>
+      <w:r>
+        <w:rPr>
+          <w:lang w:val="en"/>
+        </w:rPr>
+        <w:t xml:space="preserve">outstanding obligation. Shared vocabulary alone does not establish mathematical</w:t>
+      </w:r>
+      <w:r>
+        <w:rPr>
+          <w:lang w:val="en"/>
+        </w:rPr>
+        <w:t xml:space="preserve"> </w:t>
+      </w:r>
+      <w:r>
+        <w:rPr>
+          <w:lang w:val="en"/>
+        </w:rPr>
+        <w:t xml:space="preserve">equivalence. A future bridge must supply a carrier interpretation, type and argument</w:t>
+      </w:r>
+      <w:r>
+        <w:rPr>
+          <w:lang w:val="en"/>
+        </w:rPr>
+        <w:t xml:space="preserve"> </w:t>
+      </w:r>
+      <w:r>
+        <w:rPr>
+          <w:lang w:val="en"/>
+        </w:rPr>
+        <w:t xml:space="preserve">translation, normalization and support conditions, and a soundness argument for</w:t>
+      </w:r>
+      <w:r>
+        <w:rPr>
+          <w:lang w:val="en"/>
+        </w:rPr>
+        <w:t xml:space="preserve"> </w:t>
+      </w:r>
+      <w:r>
+        <w:rPr>
+          <w:lang w:val="en"/>
+        </w:rPr>
+        <w:t xml:space="preserve">the exact target fragment.</w:t>
+      </w:r>
+    </w:p>
+    <w:p>
+      <w:pPr>
+        <w:pStyle w:val="BodyText"/>
+      </w:pPr>
+      <w:r>
+        <w:rPr>
+          <w:lang w:val="en"/>
+        </w:rPr>
+        <w:t xml:space="preserve">The separate</w:t>
+      </w:r>
+      <w:r>
+        <w:rPr>
+          <w:lang w:val="en"/>
+        </w:rPr>
+        <w:t xml:space="preserve"> </w:t>
+      </w:r>
+      <w:r>
+        <w:rPr>
+          <w:rStyle w:val="VerbatimChar"/>
+          <w:lang w:val="en"/>
+        </w:rPr>
+        <w:t xml:space="preserve">examples/fep-ontology.kif</w:t>
+      </w:r>
+      <w:r>
+        <w:rPr>
+          <w:lang w:val="en"/>
+        </w:rPr>
+        <w:t xml:space="preserve"> </w:t>
+      </w:r>
+      <w:r>
+        <w:rPr>
+          <w:lang w:val="en"/>
+        </w:rPr>
+        <w:t xml:space="preserve">extension gives an inspectable vocabulary</w:t>
+      </w:r>
+      <w:r>
+        <w:rPr>
+          <w:lang w:val="en"/>
+        </w:rPr>
+        <w:t xml:space="preserve"> </w:t>
+      </w:r>
+      <w:r>
+        <w:rPr>
+          <w:lang w:val="en"/>
+        </w:rPr>
+        <w:t xml:space="preserve">experiment:</w:t>
+      </w:r>
+      <w:r>
+        <w:rPr>
+          <w:lang w:val="en"/>
+        </w:rPr>
+        <w:t xml:space="preserve"> </w:t>
+      </w:r>
+      <w:r>
+        <w:rPr>
+          <w:rStyle w:val="VerbatimChar"/>
+          <w:lang w:val="en"/>
+        </w:rPr>
+        <w:t xml:space="preserve">RikishiVariationalInference</w:t>
+      </w:r>
+      <w:r>
+        <w:rPr>
+          <w:lang w:val="en"/>
+        </w:rPr>
+        <w:t xml:space="preserve"> </w:t>
+      </w:r>
+      <w:r>
+        <w:rPr>
+          <w:lang w:val="en"/>
+        </w:rPr>
+        <w:t xml:space="preserve">is proposed as a subclass of</w:t>
+      </w:r>
+      <w:r>
+        <w:rPr>
+          <w:lang w:val="en"/>
+        </w:rPr>
+        <w:t xml:space="preserve"> </w:t>
+      </w:r>
+      <w:r>
+        <w:rPr>
+          <w:rStyle w:val="VerbatimChar"/>
+          <w:lang w:val="en"/>
+        </w:rPr>
+        <w:t xml:space="preserve">Reasoning</w:t>
+      </w:r>
+      <w:r>
+        <w:rPr>
+          <w:lang w:val="en"/>
+        </w:rPr>
+        <w:t xml:space="preserve">,</w:t>
+      </w:r>
+      <w:r>
+        <w:rPr>
+          <w:lang w:val="en"/>
+        </w:rPr>
+        <w:t xml:space="preserve"> </w:t>
+      </w:r>
+      <w:r>
+        <w:rPr>
+          <w:rStyle w:val="VerbatimChar"/>
+          <w:lang w:val="en"/>
+        </w:rPr>
+        <w:t xml:space="preserve">RikishiFiniteGenerativeModel</w:t>
+      </w:r>
+      <w:r>
+        <w:rPr>
+          <w:lang w:val="en"/>
+        </w:rPr>
+        <w:t xml:space="preserve"> </w:t>
+      </w:r>
+      <w:r>
+        <w:rPr>
+          <w:lang w:val="en"/>
+        </w:rPr>
+        <w:t xml:space="preserve">as a subclass of</w:t>
+      </w:r>
+      <w:r>
+        <w:rPr>
+          <w:lang w:val="en"/>
+        </w:rPr>
+        <w:t xml:space="preserve"> </w:t>
+      </w:r>
+      <w:r>
+        <w:rPr>
+          <w:rStyle w:val="VerbatimChar"/>
+          <w:lang w:val="en"/>
+        </w:rPr>
+        <w:t xml:space="preserve">Proposition</w:t>
+      </w:r>
+      <w:r>
+        <w:rPr>
+          <w:lang w:val="en"/>
+        </w:rPr>
+        <w:t xml:space="preserve">, and the binary example</w:t>
+      </w:r>
+      <w:r>
+        <w:rPr>
+          <w:lang w:val="en"/>
+        </w:rPr>
+        <w:t xml:space="preserve"> </w:t>
+      </w:r>
+      <w:r>
+        <w:rPr>
+          <w:lang w:val="en"/>
+        </w:rPr>
+        <w:t xml:space="preserve">as an instance of the inference class. The six formulas include documentation of</w:t>
+      </w:r>
+      <w:r>
+        <w:rPr>
+          <w:lang w:val="en"/>
+        </w:rPr>
+        <w:t xml:space="preserve"> </w:t>
+      </w:r>
+      <w:r>
+        <w:rPr>
+          <w:lang w:val="en"/>
+        </w:rPr>
+        <w:t xml:space="preserve">their intended use and limitations. These author-created assertions are kept</w:t>
+      </w:r>
+      <w:r>
+        <w:rPr>
+          <w:lang w:val="en"/>
+        </w:rPr>
+        <w:t xml:space="preserve"> </w:t>
+      </w:r>
+      <w:r>
+        <w:rPr>
+          <w:lang w:val="en"/>
+        </w:rPr>
+        <w:t xml:space="preserve">outside the upstream checkout. They neither enforce numerical normalization nor</w:t>
+      </w:r>
+      <w:r>
+        <w:rPr>
+          <w:lang w:val="en"/>
+        </w:rPr>
+        <w:t xml:space="preserve"> </w:t>
+      </w:r>
+      <w:r>
+        <w:rPr>
+          <w:lang w:val="en"/>
+        </w:rPr>
+        <w:t xml:space="preserve">transport a Lean proof; their adequacy as an ontology model remains a research</w:t>
+      </w:r>
+      <w:r>
+        <w:rPr>
+          <w:lang w:val="en"/>
+        </w:rPr>
+        <w:t xml:space="preserve"> </w:t>
+      </w:r>
+      <w:r>
+        <w:rPr>
+          <w:lang w:val="en"/>
+        </w:rPr>
+        <w:t xml:space="preserve">question requiring explicit interpretation and review.</w:t>
       </w:r>
     </w:p>
     <w:p>
       <w:pPr>
         <w:pStyle w:val="Heading1"/>
       </w:pPr>
-      <w:bookmarkStart w:id="27" w:name="_ffaf382adbf3a03d492e21c499facb8265e1add"/>
-      <w:r>
-        <w:rPr>
-          <w:lang w:val="en"/>
-        </w:rPr>
-        <w:t xml:space="preserve">Contribution and limitations</w:t>
-      </w:r>
-      <w:bookmarkEnd w:id="27"/>
-    </w:p>
-    <w:p>
-      <w:pPr>
-        <w:pStyle w:val="FirstParagraph"/>
-      </w:pPr>
-      <w:r>
-        <w:rPr>
-          <w:lang w:val="en"/>
-        </w:rPr>
-        <w:t xml:space="preserve">Upstream issues and pull requests should contain a minimal reproducer and a precise</w:t>
-      </w:r>
-      <w:r>
-        <w:rPr>
-          <w:lang w:val="en"/>
-        </w:rPr>
-        <w:t xml:space="preserve"> </w:t>
-      </w:r>
-      <w:r>
-        <w:rPr>
-          <w:lang w:val="en"/>
-        </w:rPr>
-        <w:t xml:space="preserve">claim. Timeout or unknown proof-search status does not establish that a statement</w:t>
-      </w:r>
-      <w:r>
-        <w:rPr>
-          <w:lang w:val="en"/>
-        </w:rPr>
-        <w:t xml:space="preserve"> </w:t>
-      </w:r>
-      <w:r>
-        <w:rPr>
-          <w:lang w:val="en"/>
-        </w:rPr>
-        <w:t xml:space="preserve">is false. A vocabulary mismatch does not establish an ontology defect. Private</w:t>
-      </w:r>
-      <w:r>
-        <w:rPr>
-          <w:lang w:val="en"/>
-        </w:rPr>
-        <w:t xml:space="preserve"> </w:t>
-      </w:r>
-      <w:r>
-        <w:rPr>
-          <w:lang w:val="en"/>
-        </w:rPr>
-        <w:t xml:space="preserve">research content should be excluded from public reports unless deliberately released.</w:t>
-      </w:r>
-    </w:p>
-    <w:p>
-      <w:pPr>
-        <w:pStyle w:val="BodyText"/>
-      </w:pPr>
-      <w:r>
-        <w:rPr>
-          <w:lang w:val="en"/>
-        </w:rPr>
-        <w:t xml:space="preserve">The present numerical module uses floating-point arithmetic and a finite carrier.</w:t>
-      </w:r>
-      <w:r>
-        <w:rPr>
-          <w:lang w:val="en"/>
-        </w:rPr>
-        <w:t xml:space="preserve"> </w:t>
-      </w:r>
-      <w:r>
-        <w:rPr>
-          <w:lang w:val="en"/>
-        </w:rPr>
-        <w:t xml:space="preserve">It does not provide arbitrary-precision or log-domain inference, continuous-state</w:t>
-      </w:r>
-      <w:r>
-        <w:rPr>
-          <w:lang w:val="en"/>
-        </w:rPr>
-        <w:t xml:space="preserve"> </w:t>
-      </w:r>
-      <w:r>
-        <w:rPr>
-          <w:lang w:val="en"/>
-        </w:rPr>
-        <w:t xml:space="preserve">models, learned likelihoods, or biological parameter estimation. The source bridge</w:t>
-      </w:r>
-      <w:r>
-        <w:rPr>
-          <w:lang w:val="en"/>
-        </w:rPr>
-        <w:t xml:space="preserve"> </w:t>
-      </w:r>
-      <w:r>
-        <w:rPr>
-          <w:lang w:val="en"/>
-        </w:rPr>
-        <w:t xml:space="preserve">does not perform automatic ontology-to-Lean translation. The dashboard is a local</w:t>
-      </w:r>
-      <w:r>
-        <w:rPr>
-          <w:lang w:val="en"/>
-        </w:rPr>
-        <w:t xml:space="preserve"> </w:t>
-      </w:r>
-      <w:r>
-        <w:rPr>
-          <w:lang w:val="en"/>
-        </w:rPr>
-        <w:t xml:space="preserve">research interface whose deployment security requires separate evaluation before</w:t>
-      </w:r>
-      <w:r>
-        <w:rPr>
-          <w:lang w:val="en"/>
-        </w:rPr>
-        <w:t xml:space="preserve"> </w:t>
-      </w:r>
-      <w:r>
-        <w:rPr>
-          <w:lang w:val="en"/>
-        </w:rPr>
-        <w:t xml:space="preserve">public hosting. These boundaries make the package’s evidence interpretable and</w:t>
-      </w:r>
-      <w:r>
-        <w:rPr>
-          <w:lang w:val="en"/>
-        </w:rPr>
-        <w:t xml:space="preserve"> </w:t>
-      </w:r>
-      <w:r>
-        <w:rPr>
-          <w:lang w:val="en"/>
-        </w:rPr>
-        <w:t xml:space="preserve">define concrete next experiments.</w:t>
-      </w:r>
-    </w:p>
-    <w:p>
-      <w:pPr>
-        <w:pStyle w:val="Heading1"/>
-      </w:pPr>
-      <w:bookmarkStart w:id="28" w:name="_sources"/>
-      <w:r>
-        <w:rPr>
-          <w:lang w:val="en"/>
-        </w:rPr>
-        <w:t xml:space="preserve">Sources</w:t>
-      </w:r>
-      <w:bookmarkEnd w:id="28"/>
+      <w:bookmarkStart w:id="35" w:name="_79901e7c21d0568c315d1f541fad2179ae2a52b"/>
+      <w:r>
+        <w:rPr>
+          <w:lang w:val="en"/>
+        </w:rPr>
+        <w:t xml:space="preserve">Reproducible workflow</w:t>
+      </w:r>
+      <w:bookmarkEnd w:id="35"/>
     </w:p>
     <w:p>
       <w:pPr>
@@ -3068,6 +3395,598 @@
         <w:numPr>
           <w:ilvl w:val="0"/>
           <w:numId w:val="1002"/>
+        </w:numPr>
+      </w:pPr>
+      <w:r>
+        <w:rPr>
+          <w:lang w:val="en"/>
+        </w:rPr>
+        <w:t xml:space="preserve">Prepare the declared Python environment and external storage paths.</w:t>
+      </w:r>
+    </w:p>
+    <w:p>
+      <w:pPr>
+        <w:pStyle w:val="Compact"/>
+        <w:numPr>
+          <w:ilvl w:val="0"/>
+          <w:numId w:val="1002"/>
+        </w:numPr>
+      </w:pPr>
+      <w:r>
+        <w:rPr>
+          <w:lang w:val="en"/>
+        </w:rPr>
+        <w:t xml:space="preserve">Install the pinned SUMO sources and runtime using the package’s operator commands.</w:t>
+      </w:r>
+    </w:p>
+    <w:p>
+      <w:pPr>
+        <w:pStyle w:val="Compact"/>
+        <w:numPr>
+          <w:ilvl w:val="0"/>
+          <w:numId w:val="1002"/>
+        </w:numPr>
+      </w:pPr>
+      <w:r>
+        <w:rPr>
+          <w:lang w:val="en"/>
+        </w:rPr>
+        <w:t xml:space="preserve">Record source and tool identities before indexing or reasoning.</w:t>
+      </w:r>
+    </w:p>
+    <w:p>
+      <w:pPr>
+        <w:pStyle w:val="Compact"/>
+        <w:numPr>
+          <w:ilvl w:val="0"/>
+          <w:numId w:val="1002"/>
+        </w:numPr>
+      </w:pPr>
+      <w:r>
+        <w:rPr>
+          <w:lang w:val="en"/>
+        </w:rPr>
+        <w:t xml:space="preserve">Retain query, source context, diagnostics, and proof-search output together.</w:t>
+      </w:r>
+    </w:p>
+    <w:p>
+      <w:pPr>
+        <w:pStyle w:val="Compact"/>
+        <w:numPr>
+          <w:ilvl w:val="0"/>
+          <w:numId w:val="1002"/>
+        </w:numPr>
+      </w:pPr>
+      <w:r>
+        <w:rPr>
+          <w:lang w:val="en"/>
+        </w:rPr>
+        <w:t xml:space="preserve">Execute the finite example and inspect its residual and negative controls.</w:t>
+      </w:r>
+    </w:p>
+    <w:p>
+      <w:pPr>
+        <w:pStyle w:val="Compact"/>
+        <w:numPr>
+          <w:ilvl w:val="0"/>
+          <w:numId w:val="1002"/>
+        </w:numPr>
+      </w:pPr>
+      <w:r>
+        <w:rPr>
+          <w:lang w:val="en"/>
+        </w:rPr>
+        <w:t xml:space="preserve">Render this manuscript through the docxology/template adapters and inspect the</w:t>
+      </w:r>
+      <w:r>
+        <w:rPr>
+          <w:lang w:val="en"/>
+        </w:rPr>
+        <w:t xml:space="preserve"> </w:t>
+      </w:r>
+      <w:r>
+        <w:rPr>
+          <w:lang w:val="en"/>
+        </w:rPr>
+        <w:t xml:space="preserve">resulting PDF, DOCX, and HTML.</w:t>
+      </w:r>
+    </w:p>
+    <w:p>
+      <w:pPr>
+        <w:pStyle w:val="FirstParagraph"/>
+      </w:pPr>
+      <w:r>
+        <w:rPr>
+          <w:lang w:val="en"/>
+        </w:rPr>
+        <w:t xml:space="preserve">The renderer writes numerical JSON and a figure before publication. It records</w:t>
+      </w:r>
+      <w:r>
+        <w:rPr>
+          <w:lang w:val="en"/>
+        </w:rPr>
+        <w:t xml:space="preserve"> </w:t>
+      </w:r>
+      <w:r>
+        <w:rPr>
+          <w:lang w:val="en"/>
+        </w:rPr>
+        <w:t xml:space="preserve">source and output hashes, artifact sizes, and the template revision in a receipt.</w:t>
+      </w:r>
+      <w:r>
+        <w:rPr>
+          <w:lang w:val="en"/>
+        </w:rPr>
+        <w:t xml:space="preserve"> </w:t>
+      </w:r>
+      <w:r>
+        <w:rPr>
+          <w:lang w:val="en"/>
+        </w:rPr>
+        <w:t xml:space="preserve">Those records support byte-level reproducibility and identify dependencies; they</w:t>
+      </w:r>
+      <w:r>
+        <w:rPr>
+          <w:lang w:val="en"/>
+        </w:rPr>
+        <w:t xml:space="preserve"> </w:t>
+      </w:r>
+      <w:r>
+        <w:rPr>
+          <w:lang w:val="en"/>
+        </w:rPr>
+        <w:t xml:space="preserve">do not replace scientific review. A changed upstream revision, local configuration,</w:t>
+      </w:r>
+      <w:r>
+        <w:rPr>
+          <w:lang w:val="en"/>
+        </w:rPr>
+        <w:t xml:space="preserve"> </w:t>
+      </w:r>
+      <w:r>
+        <w:rPr>
+          <w:lang w:val="en"/>
+        </w:rPr>
+        <w:t xml:space="preserve">or rendering dependency requires a fresh receipt.</w:t>
+      </w:r>
+    </w:p>
+    <w:p>
+      <w:pPr>
+        <w:pStyle w:val="BodyText"/>
+      </w:pPr>
+      <w:r>
+        <w:rPr>
+          <w:lang w:val="en"/>
+        </w:rPr>
+        <w:t xml:space="preserve">Rendering methods are importable library functions; scripts only select the</w:t>
+      </w:r>
+      <w:r>
+        <w:rPr>
+          <w:lang w:val="en"/>
+        </w:rPr>
+        <w:t xml:space="preserve"> </w:t>
+      </w:r>
+      <w:r>
+        <w:rPr>
+          <w:lang w:val="en"/>
+        </w:rPr>
+        <w:t xml:space="preserve">project root and invoke them. The provenance layer parses corpus measurements</w:t>
+      </w:r>
+      <w:r>
+        <w:rPr>
+          <w:lang w:val="en"/>
+        </w:rPr>
+        <w:t xml:space="preserve"> </w:t>
+      </w:r>
+      <w:r>
+        <w:rPr>
+          <w:lang w:val="en"/>
+        </w:rPr>
+        <w:t xml:space="preserve">through a strict schema, rejects unresolved placeholders and dirty or erroneous</w:t>
+      </w:r>
+      <w:r>
+        <w:rPr>
+          <w:lang w:val="en"/>
+        </w:rPr>
+        <w:t xml:space="preserve"> </w:t>
+      </w:r>
+      <w:r>
+        <w:rPr>
+          <w:lang w:val="en"/>
+        </w:rPr>
+        <w:t xml:space="preserve">corpora, verifies pinned renderer files before import, and verifies artifact bytes</w:t>
+      </w:r>
+      <w:r>
+        <w:rPr>
+          <w:lang w:val="en"/>
+        </w:rPr>
+        <w:t xml:space="preserve"> </w:t>
+      </w:r>
+      <w:r>
+        <w:rPr>
+          <w:lang w:val="en"/>
+        </w:rPr>
+        <w:t xml:space="preserve">after generation. Real temporary Git repositories exercise dirty-checkout isolation,</w:t>
+      </w:r>
+      <w:r>
+        <w:rPr>
+          <w:lang w:val="en"/>
+        </w:rPr>
+        <w:t xml:space="preserve"> </w:t>
+      </w:r>
+      <w:r>
+        <w:rPr>
+          <w:lang w:val="en"/>
+        </w:rPr>
+        <w:t xml:space="preserve">snapshot corruption, symlink rejection, and malformed manifests. Receipt checks</w:t>
+      </w:r>
+      <w:r>
+        <w:rPr>
+          <w:lang w:val="en"/>
+        </w:rPr>
+        <w:t xml:space="preserve"> </w:t>
+      </w:r>
+      <w:r>
+        <w:rPr>
+          <w:lang w:val="en"/>
+        </w:rPr>
+        <w:t xml:space="preserve">raise explicit exceptions and remain active under Python optimization. These</w:t>
+      </w:r>
+      <w:r>
+        <w:rPr>
+          <w:lang w:val="en"/>
+        </w:rPr>
+        <w:t xml:space="preserve"> </w:t>
+      </w:r>
+      <w:r>
+        <w:rPr>
+          <w:lang w:val="en"/>
+        </w:rPr>
+        <w:t xml:space="preserve">controls establish input/output integrity, not semantic correctness of the sources.</w:t>
+      </w:r>
+    </w:p>
+    <w:p>
+      <w:pPr>
+        <w:pStyle w:val="Heading1"/>
+      </w:pPr>
+      <w:bookmarkStart w:id="36" w:name="_ffaf382adbf3a03d492e21c499facb8265e1add"/>
+      <w:r>
+        <w:rPr>
+          <w:lang w:val="en"/>
+        </w:rPr>
+        <w:t xml:space="preserve">Contribution and limitations</w:t>
+      </w:r>
+      <w:bookmarkEnd w:id="36"/>
+    </w:p>
+    <w:p>
+      <w:pPr>
+        <w:pStyle w:val="FirstParagraph"/>
+      </w:pPr>
+      <w:r>
+        <w:rPr>
+          <w:lang w:val="en"/>
+        </w:rPr>
+        <w:t xml:space="preserve">Upstream issues and pull requests should contain a minimal reproducer and a precise</w:t>
+      </w:r>
+      <w:r>
+        <w:rPr>
+          <w:lang w:val="en"/>
+        </w:rPr>
+        <w:t xml:space="preserve"> </w:t>
+      </w:r>
+      <w:r>
+        <w:rPr>
+          <w:lang w:val="en"/>
+        </w:rPr>
+        <w:t xml:space="preserve">claim. Timeout or unknown proof-search status does not establish that a statement</w:t>
+      </w:r>
+      <w:r>
+        <w:rPr>
+          <w:lang w:val="en"/>
+        </w:rPr>
+        <w:t xml:space="preserve"> </w:t>
+      </w:r>
+      <w:r>
+        <w:rPr>
+          <w:lang w:val="en"/>
+        </w:rPr>
+        <w:t xml:space="preserve">is false. A vocabulary mismatch does not establish an ontology defect. Private</w:t>
+      </w:r>
+      <w:r>
+        <w:rPr>
+          <w:lang w:val="en"/>
+        </w:rPr>
+        <w:t xml:space="preserve"> </w:t>
+      </w:r>
+      <w:r>
+        <w:rPr>
+          <w:lang w:val="en"/>
+        </w:rPr>
+        <w:t xml:space="preserve">research content should be excluded from public reports unless deliberately released.</w:t>
+      </w:r>
+    </w:p>
+    <w:p>
+      <w:pPr>
+        <w:pStyle w:val="BodyText"/>
+      </w:pPr>
+      <w:r>
+        <w:rPr>
+          <w:lang w:val="en"/>
+        </w:rPr>
+        <w:t xml:space="preserve">The present numerical module uses floating-point arithmetic and a finite carrier.</w:t>
+      </w:r>
+      <w:r>
+        <w:rPr>
+          <w:lang w:val="en"/>
+        </w:rPr>
+        <w:t xml:space="preserve"> </w:t>
+      </w:r>
+      <w:r>
+        <w:rPr>
+          <w:lang w:val="en"/>
+        </w:rPr>
+        <w:t xml:space="preserve">It does not provide arbitrary-precision or log-domain inference, continuous-state</w:t>
+      </w:r>
+      <w:r>
+        <w:rPr>
+          <w:lang w:val="en"/>
+        </w:rPr>
+        <w:t xml:space="preserve"> </w:t>
+      </w:r>
+      <w:r>
+        <w:rPr>
+          <w:lang w:val="en"/>
+        </w:rPr>
+        <w:t xml:space="preserve">models, learned likelihoods, or biological parameter estimation. The source bridge</w:t>
+      </w:r>
+      <w:r>
+        <w:rPr>
+          <w:lang w:val="en"/>
+        </w:rPr>
+        <w:t xml:space="preserve"> </w:t>
+      </w:r>
+      <w:r>
+        <w:rPr>
+          <w:lang w:val="en"/>
+        </w:rPr>
+        <w:t xml:space="preserve">does not perform automatic ontology-to-Lean translation. The dashboard is a local</w:t>
+      </w:r>
+      <w:r>
+        <w:rPr>
+          <w:lang w:val="en"/>
+        </w:rPr>
+        <w:t xml:space="preserve"> </w:t>
+      </w:r>
+      <w:r>
+        <w:rPr>
+          <w:lang w:val="en"/>
+        </w:rPr>
+        <w:t xml:space="preserve">research interface whose deployment security requires separate evaluation before</w:t>
+      </w:r>
+      <w:r>
+        <w:rPr>
+          <w:lang w:val="en"/>
+        </w:rPr>
+        <w:t xml:space="preserve"> </w:t>
+      </w:r>
+      <w:r>
+        <w:rPr>
+          <w:lang w:val="en"/>
+        </w:rPr>
+        <w:t xml:space="preserve">public hosting. These boundaries make the package’s evidence interpretable and</w:t>
+      </w:r>
+      <w:r>
+        <w:rPr>
+          <w:lang w:val="en"/>
+        </w:rPr>
+        <w:t xml:space="preserve"> </w:t>
+      </w:r>
+      <w:r>
+        <w:rPr>
+          <w:lang w:val="en"/>
+        </w:rPr>
+        <w:t xml:space="preserve">define concrete next experiments.</w:t>
+      </w:r>
+    </w:p>
+    <w:p>
+      <w:pPr>
+        <w:pStyle w:val="Heading1"/>
+      </w:pPr>
+      <w:bookmarkStart w:id="37" w:name="_sources"/>
+      <w:r>
+        <w:rPr>
+          <w:lang w:val="en"/>
+        </w:rPr>
+        <w:t xml:space="preserve">Sources</w:t>
+      </w:r>
+      <w:bookmarkEnd w:id="37"/>
+    </w:p>
+    <w:p>
+      <w:pPr>
+        <w:pStyle w:val="Compact"/>
+        <w:numPr>
+          <w:ilvl w:val="0"/>
+          <w:numId w:val="1003"/>
+        </w:numPr>
+      </w:pPr>
+      <w:r>
+        <w:rPr>
+          <w:lang w:val="en"/>
+        </w:rPr>
+        <w:t xml:space="preserve">Niles, I., and Pease, A. (2001).</w:t>
+      </w:r>
+      <w:r>
+        <w:rPr>
+          <w:lang w:val="en"/>
+        </w:rPr>
+        <w:t xml:space="preserve"> </w:t>
+      </w:r>
+      <w:hyperlink r:id="rId12">
+        <w:r>
+          <w:rPr>
+            <w:rStyle w:val="Hyperlink"/>
+            <w:lang w:val="en"/>
+          </w:rPr>
+          <w:t xml:space="preserve">Towards a Standard Upper Ontology</w:t>
+        </w:r>
+      </w:hyperlink>
+      <w:r>
+        <w:rPr>
+          <w:lang w:val="en"/>
+        </w:rPr>
+        <w:t xml:space="preserve">. Proceedings of FOIS, 2-9. DOI: 10.1145/505168.505170.</w:t>
+      </w:r>
+    </w:p>
+    <w:p>
+      <w:pPr>
+        <w:pStyle w:val="Compact"/>
+        <w:numPr>
+          <w:ilvl w:val="0"/>
+          <w:numId w:val="1003"/>
+        </w:numPr>
+      </w:pPr>
+      <w:r>
+        <w:rPr>
+          <w:lang w:val="en"/>
+        </w:rPr>
+        <w:t xml:space="preserve">Pease, A. (2023).</w:t>
+      </w:r>
+      <w:r>
+        <w:rPr>
+          <w:lang w:val="en"/>
+        </w:rPr>
+        <w:t xml:space="preserve"> </w:t>
+      </w:r>
+      <w:hyperlink r:id="rId14">
+        <w:r>
+          <w:rPr>
+            <w:rStyle w:val="Hyperlink"/>
+            <w:lang w:val="en"/>
+          </w:rPr>
+          <w:t xml:space="preserve">Converting the Suggested Upper Merged Ontology to Typed First-order Form</w:t>
+        </w:r>
+      </w:hyperlink>
+      <w:r>
+        <w:rPr>
+          <w:lang w:val="en"/>
+        </w:rPr>
+        <w:t xml:space="preserve">. arXiv:2303.04148.</w:t>
+      </w:r>
+    </w:p>
+    <w:p>
+      <w:pPr>
+        <w:pStyle w:val="Compact"/>
+        <w:numPr>
+          <w:ilvl w:val="0"/>
+          <w:numId w:val="1003"/>
+        </w:numPr>
+      </w:pPr>
+      <w:r>
+        <w:rPr>
+          <w:lang w:val="en"/>
+        </w:rPr>
+        <w:t xml:space="preserve">Blei, D. M., Kucukelbir, A., and McAuliffe, J. D. (2017).</w:t>
+      </w:r>
+      <w:r>
+        <w:rPr>
+          <w:lang w:val="en"/>
+        </w:rPr>
+        <w:t xml:space="preserve"> </w:t>
+      </w:r>
+      <w:hyperlink r:id="rId38">
+        <w:r>
+          <w:rPr>
+            <w:rStyle w:val="Hyperlink"/>
+            <w:lang w:val="en"/>
+          </w:rPr>
+          <w:t xml:space="preserve">Variational Inference: A Review for Statisticians</w:t>
+        </w:r>
+      </w:hyperlink>
+      <w:r>
+        <w:rPr>
+          <w:lang w:val="en"/>
+        </w:rPr>
+        <w:t xml:space="preserve">. Journal of the American Statistical Association, 112(518), 859-877.</w:t>
+      </w:r>
+    </w:p>
+    <w:p>
+      <w:pPr>
+        <w:pStyle w:val="Compact"/>
+        <w:numPr>
+          <w:ilvl w:val="0"/>
+          <w:numId w:val="1003"/>
+        </w:numPr>
+      </w:pPr>
+      <w:r>
+        <w:rPr>
+          <w:lang w:val="en"/>
+        </w:rPr>
+        <w:t xml:space="preserve">Friston, K. (2010).</w:t>
+      </w:r>
+      <w:r>
+        <w:rPr>
+          <w:lang w:val="en"/>
+        </w:rPr>
+        <w:t xml:space="preserve"> </w:t>
+      </w:r>
+      <w:hyperlink r:id="rId30">
+        <w:r>
+          <w:rPr>
+            <w:rStyle w:val="Hyperlink"/>
+            <w:lang w:val="en"/>
+          </w:rPr>
+          <w:t xml:space="preserve">The free-energy principle: a unified brain theory?</w:t>
+        </w:r>
+      </w:hyperlink>
+      <w:r>
+        <w:rPr>
+          <w:lang w:val="en"/>
+        </w:rPr>
+        <w:t xml:space="preserve">. Nature Reviews Neuroscience, 11, 127-138.</w:t>
+      </w:r>
+    </w:p>
+    <w:p>
+      <w:pPr>
+        <w:pStyle w:val="Compact"/>
+        <w:numPr>
+          <w:ilvl w:val="0"/>
+          <w:numId w:val="1003"/>
+        </w:numPr>
+      </w:pPr>
+      <w:r>
+        <w:rPr>
+          <w:lang w:val="en"/>
+        </w:rPr>
+        <w:t xml:space="preserve">TPTP.</w:t>
+      </w:r>
+      <w:r>
+        <w:rPr>
+          <w:lang w:val="en"/>
+        </w:rPr>
+        <w:t xml:space="preserve"> </w:t>
+      </w:r>
+      <w:hyperlink r:id="rId27">
+        <w:r>
+          <w:rPr>
+            <w:rStyle w:val="Hyperlink"/>
+            <w:lang w:val="en"/>
+          </w:rPr>
+          <w:t xml:space="preserve">The SZS Ontologies</w:t>
+        </w:r>
+      </w:hyperlink>
+      <w:r>
+        <w:rPr>
+          <w:lang w:val="en"/>
+        </w:rPr>
+        <w:t xml:space="preserve">. Status semantics and reporting conventions.</w:t>
+      </w:r>
+    </w:p>
+    <w:p>
+      <w:pPr>
+        <w:pStyle w:val="Compact"/>
+        <w:numPr>
+          <w:ilvl w:val="0"/>
+          <w:numId w:val="1003"/>
         </w:numPr>
       </w:pPr>
       <w:hyperlink r:id="rId11">
@@ -3091,10 +4010,10 @@
         <w:pStyle w:val="Compact"/>
         <w:numPr>
           <w:ilvl w:val="0"/>
-          <w:numId w:val="1002"/>
+          <w:numId w:val="1003"/>
         </w:numPr>
       </w:pPr>
-      <w:hyperlink r:id="rId29">
+      <w:hyperlink r:id="rId39">
         <w:r>
           <w:rPr>
             <w:rStyle w:val="Hyperlink"/>
@@ -3115,10 +4034,10 @@
         <w:pStyle w:val="Compact"/>
         <w:numPr>
           <w:ilvl w:val="0"/>
-          <w:numId w:val="1002"/>
+          <w:numId w:val="1003"/>
         </w:numPr>
       </w:pPr>
-      <w:hyperlink r:id="rId30">
+      <w:hyperlink r:id="rId40">
         <w:r>
           <w:rPr>
             <w:rStyle w:val="Hyperlink"/>
@@ -3139,10 +4058,10 @@
         <w:pStyle w:val="Compact"/>
         <w:numPr>
           <w:ilvl w:val="0"/>
-          <w:numId w:val="1002"/>
+          <w:numId w:val="1003"/>
         </w:numPr>
       </w:pPr>
-      <w:hyperlink r:id="rId31">
+      <w:hyperlink r:id="rId41">
         <w:r>
           <w:rPr>
             <w:rStyle w:val="Hyperlink"/>
@@ -3268,6 +4187,109 @@
       </w:pPr>
     </w:lvl>
   </w:abstractNum>
+  <w:abstractNum w:abstractNumId="991">
+    <w:nsid w:val="0000A991"/>
+    <w:multiLevelType w:val="multilevel"/>
+    <w:lvl w:ilvl="0">
+      <w:numFmt w:val="bullet"/>
+      <w:lvlText w:val=""/>
+      <w:lvlJc w:val="left"/>
+      <w:pPr>
+        <w:ind w:left="720" w:hanging="360"/>
+      </w:pPr>
+      <w:rPr>
+        <w:rFonts w:ascii="Symbol" w:hAnsi="Symbol" w:cs="Symbol" w:hint="default"/>
+      </w:rPr>
+    </w:lvl>
+    <w:lvl w:ilvl="1">
+      <w:numFmt w:val="bullet"/>
+      <w:lvlText w:val="o"/>
+      <w:lvlJc w:val="left"/>
+      <w:pPr>
+        <w:ind w:left="1440" w:hanging="360"/>
+      </w:pPr>
+      <w:rPr>
+        <w:rFonts w:ascii="Courier New" w:hAnsi="Courier New" w:cs="Courier New" w:hint="default"/>
+      </w:rPr>
+    </w:lvl>
+    <w:lvl w:ilvl="2">
+      <w:numFmt w:val="bullet"/>
+      <w:lvlText w:val=""/>
+      <w:lvlJc w:val="left"/>
+      <w:pPr>
+        <w:ind w:left="2160" w:hanging="360"/>
+      </w:pPr>
+      <w:rPr>
+        <w:rFonts w:ascii="Wingdings" w:hAnsi="Wingdings" w:cs="Wingdings" w:hint="default"/>
+      </w:rPr>
+    </w:lvl>
+    <w:lvl w:ilvl="3">
+      <w:numFmt w:val="bullet"/>
+      <w:lvlText w:val=""/>
+      <w:lvlJc w:val="left"/>
+      <w:pPr>
+        <w:ind w:left="2880" w:hanging="360"/>
+      </w:pPr>
+      <w:rPr>
+        <w:rFonts w:ascii="Symbol" w:hAnsi="Symbol" w:cs="Symbol" w:hint="default"/>
+      </w:rPr>
+    </w:lvl>
+    <w:lvl w:ilvl="4">
+      <w:numFmt w:val="bullet"/>
+      <w:lvlText w:val="o"/>
+      <w:lvlJc w:val="left"/>
+      <w:pPr>
+        <w:ind w:left="3600" w:hanging="360"/>
+      </w:pPr>
+      <w:rPr>
+        <w:rFonts w:ascii="Courier New" w:hAnsi="Courier New" w:cs="Courier New" w:hint="default"/>
+      </w:rPr>
+    </w:lvl>
+    <w:lvl w:ilvl="5">
+      <w:numFmt w:val="bullet"/>
+      <w:lvlText w:val=""/>
+      <w:lvlJc w:val="left"/>
+      <w:pPr>
+        <w:ind w:left="4320" w:hanging="360"/>
+      </w:pPr>
+      <w:rPr>
+        <w:rFonts w:ascii="Wingdings" w:hAnsi="Wingdings" w:cs="Wingdings" w:hint="default"/>
+      </w:rPr>
+    </w:lvl>
+    <w:lvl w:ilvl="6">
+      <w:numFmt w:val="bullet"/>
+      <w:lvlText w:val=""/>
+      <w:lvlJc w:val="left"/>
+      <w:pPr>
+        <w:ind w:left="5040" w:hanging="360"/>
+      </w:pPr>
+      <w:rPr>
+        <w:rFonts w:ascii="Symbol" w:hAnsi="Symbol" w:cs="Symbol" w:hint="default"/>
+      </w:rPr>
+    </w:lvl>
+    <w:lvl w:ilvl="7">
+      <w:numFmt w:val="bullet"/>
+      <w:lvlText w:val="o"/>
+      <w:lvlJc w:val="left"/>
+      <w:pPr>
+        <w:ind w:left="5760" w:hanging="360"/>
+      </w:pPr>
+      <w:rPr>
+        <w:rFonts w:ascii="Courier New" w:hAnsi="Courier New" w:cs="Courier New" w:hint="default"/>
+      </w:rPr>
+    </w:lvl>
+    <w:lvl w:ilvl="8">
+      <w:numFmt w:val="bullet"/>
+      <w:lvlText w:val=""/>
+      <w:lvlJc w:val="left"/>
+      <w:pPr>
+        <w:ind w:left="6480" w:hanging="360"/>
+      </w:pPr>
+      <w:rPr>
+        <w:rFonts w:ascii="Wingdings" w:hAnsi="Wingdings" w:cs="Wingdings" w:hint="default"/>
+      </w:rPr>
+    </w:lvl>
+  </w:abstractNum>
   <w:abstractNum w:abstractNumId="99411">
     <w:nsid w:val="00A99411"/>
     <w:multiLevelType w:val="multilevel"/>
@@ -3353,113 +4375,13 @@
       </w:pPr>
     </w:lvl>
   </w:abstractNum>
-  <w:abstractNum w:abstractNumId="991">
-    <w:nsid w:val="0000A991"/>
-    <w:multiLevelType w:val="multilevel"/>
-    <w:lvl w:ilvl="0">
-      <w:numFmt w:val="bullet"/>
-      <w:lvlText w:val=""/>
-      <w:lvlJc w:val="left"/>
-      <w:pPr>
-        <w:ind w:left="720" w:hanging="360"/>
-      </w:pPr>
-      <w:rPr>
-        <w:rFonts w:ascii="Symbol" w:hAnsi="Symbol" w:cs="Symbol" w:hint="default"/>
-      </w:rPr>
-    </w:lvl>
-    <w:lvl w:ilvl="1">
-      <w:numFmt w:val="bullet"/>
-      <w:lvlText w:val="o"/>
-      <w:lvlJc w:val="left"/>
-      <w:pPr>
-        <w:ind w:left="1440" w:hanging="360"/>
-      </w:pPr>
-      <w:rPr>
-        <w:rFonts w:ascii="Courier New" w:hAnsi="Courier New" w:cs="Courier New" w:hint="default"/>
-      </w:rPr>
-    </w:lvl>
-    <w:lvl w:ilvl="2">
-      <w:numFmt w:val="bullet"/>
-      <w:lvlText w:val=""/>
-      <w:lvlJc w:val="left"/>
-      <w:pPr>
-        <w:ind w:left="2160" w:hanging="360"/>
-      </w:pPr>
-      <w:rPr>
-        <w:rFonts w:ascii="Wingdings" w:hAnsi="Wingdings" w:cs="Wingdings" w:hint="default"/>
-      </w:rPr>
-    </w:lvl>
-    <w:lvl w:ilvl="3">
-      <w:numFmt w:val="bullet"/>
-      <w:lvlText w:val=""/>
-      <w:lvlJc w:val="left"/>
-      <w:pPr>
-        <w:ind w:left="2880" w:hanging="360"/>
-      </w:pPr>
-      <w:rPr>
-        <w:rFonts w:ascii="Symbol" w:hAnsi="Symbol" w:cs="Symbol" w:hint="default"/>
-      </w:rPr>
-    </w:lvl>
-    <w:lvl w:ilvl="4">
-      <w:numFmt w:val="bullet"/>
-      <w:lvlText w:val="o"/>
-      <w:lvlJc w:val="left"/>
-      <w:pPr>
-        <w:ind w:left="3600" w:hanging="360"/>
-      </w:pPr>
-      <w:rPr>
-        <w:rFonts w:ascii="Courier New" w:hAnsi="Courier New" w:cs="Courier New" w:hint="default"/>
-      </w:rPr>
-    </w:lvl>
-    <w:lvl w:ilvl="5">
-      <w:numFmt w:val="bullet"/>
-      <w:lvlText w:val=""/>
-      <w:lvlJc w:val="left"/>
-      <w:pPr>
-        <w:ind w:left="4320" w:hanging="360"/>
-      </w:pPr>
-      <w:rPr>
-        <w:rFonts w:ascii="Wingdings" w:hAnsi="Wingdings" w:cs="Wingdings" w:hint="default"/>
-      </w:rPr>
-    </w:lvl>
-    <w:lvl w:ilvl="6">
-      <w:numFmt w:val="bullet"/>
-      <w:lvlText w:val=""/>
-      <w:lvlJc w:val="left"/>
-      <w:pPr>
-        <w:ind w:left="5040" w:hanging="360"/>
-      </w:pPr>
-      <w:rPr>
-        <w:rFonts w:ascii="Symbol" w:hAnsi="Symbol" w:cs="Symbol" w:hint="default"/>
-      </w:rPr>
-    </w:lvl>
-    <w:lvl w:ilvl="7">
-      <w:numFmt w:val="bullet"/>
-      <w:lvlText w:val="o"/>
-      <w:lvlJc w:val="left"/>
-      <w:pPr>
-        <w:ind w:left="5760" w:hanging="360"/>
-      </w:pPr>
-      <w:rPr>
-        <w:rFonts w:ascii="Courier New" w:hAnsi="Courier New" w:cs="Courier New" w:hint="default"/>
-      </w:rPr>
-    </w:lvl>
-    <w:lvl w:ilvl="8">
-      <w:numFmt w:val="bullet"/>
-      <w:lvlText w:val=""/>
-      <w:lvlJc w:val="left"/>
-      <w:pPr>
-        <w:ind w:left="6480" w:hanging="360"/>
-      </w:pPr>
-      <w:rPr>
-        <w:rFonts w:ascii="Wingdings" w:hAnsi="Wingdings" w:cs="Wingdings" w:hint="default"/>
-      </w:rPr>
-    </w:lvl>
-  </w:abstractNum>
   <w:num w:numId="1000">
     <w:abstractNumId w:val="990"/>
   </w:num>
   <w:num w:numId="1001">
+    <w:abstractNumId w:val="991"/>
+  </w:num>
+  <w:num w:numId="1002">
     <w:abstractNumId w:val="99411"/>
     <w:lvlOverride w:ilvl="0">
       <w:startOverride w:val="1"/>
@@ -3489,7 +4411,7 @@
       <w:startOverride w:val="1"/>
     </w:lvlOverride>
   </w:num>
-  <w:num w:numId="1002">
+  <w:num w:numId="1003">
     <w:abstractNumId w:val="991"/>
   </w:num>
 </w:numbering>

</xml_diff>